<commit_message>
udpated example for the deep search
</commit_message>
<xml_diff>
--- a/python_fastapi_ai/app/api/me/Sarat_Thokala.docx
+++ b/python_fastapi_ai/app/api/me/Sarat_Thokala.docx
@@ -1,6 +1,6 @@
 
 <file path=word/document.xml><?xml version="1.0" encoding="utf-8"?>
-<w:document xmlns:wpc="http://schemas.microsoft.com/office/word/2010/wordprocessingCanvas" xmlns:cx="http://schemas.microsoft.com/office/drawing/2014/chartex" xmlns:cx1="http://schemas.microsoft.com/office/drawing/2015/9/8/chartex" xmlns:cx2="http://schemas.microsoft.com/office/drawing/2015/10/21/chartex" xmlns:cx3="http://schemas.microsoft.com/office/drawing/2016/5/9/chartex" xmlns:cx4="http://schemas.microsoft.com/office/drawing/2016/5/10/chartex" xmlns:cx5="http://schemas.microsoft.com/office/drawing/2016/5/11/chartex" xmlns:cx6="http://schemas.microsoft.com/office/drawing/2016/5/12/chartex" xmlns:cx7="http://schemas.microsoft.com/office/drawing/2016/5/13/chartex" xmlns:cx8="http://schemas.microsoft.com/office/drawing/2016/5/14/chartex" xmlns:mc="http://schemas.openxmlformats.org/markup-compatibility/2006" xmlns:aink="http://schemas.microsoft.com/office/drawing/2016/ink" xmlns:am3d="http://schemas.microsoft.com/office/drawing/2017/model3d" xmlns:o="urn:schemas-microsoft-com:office:office" xmlns:oel="http://schemas.microsoft.com/office/2019/extlst" xmlns:r="http://schemas.openxmlformats.org/officeDocument/2006/relationships" xmlns:m="http://schemas.openxmlformats.org/officeDocument/2006/math" xmlns:v="urn:schemas-microsoft-com:vml" xmlns:wp14="http://schemas.microsoft.com/office/word/2010/wordprocessingDrawing" xmlns:wp="http://schemas.openxmlformats.org/drawingml/2006/wordprocessingDrawing" xmlns:w10="urn:schemas-microsoft-com:office:word" xmlns:w="http://schemas.openxmlformats.org/wordprocessingml/2006/main" xmlns:w14="http://schemas.microsoft.com/office/word/2010/wordml" xmlns:w15="http://schemas.microsoft.com/office/word/2012/wordml" xmlns:w16cex="http://schemas.microsoft.com/office/word/2018/wordml/cex" xmlns:w16cid="http://schemas.microsoft.com/office/word/2016/wordml/cid" xmlns:w16="http://schemas.microsoft.com/office/word/2018/wordml" xmlns:w16sdtdh="http://schemas.microsoft.com/office/word/2020/wordml/sdtdatahash" xmlns:w16se="http://schemas.microsoft.com/office/word/2015/wordml/symex" xmlns:wpg="http://schemas.microsoft.com/office/word/2010/wordprocessingGroup" xmlns:wpi="http://schemas.microsoft.com/office/word/2010/wordprocessingInk" xmlns:wne="http://schemas.microsoft.com/office/word/2006/wordml" xmlns:wps="http://schemas.microsoft.com/office/word/2010/wordprocessingShape" mc:Ignorable="w14 w15 w16se w16cid w16 w16cex w16sdtdh wp14">
+<w:document xmlns:wpc="http://schemas.microsoft.com/office/word/2010/wordprocessingCanvas" xmlns:cx="http://schemas.microsoft.com/office/drawing/2014/chartex" xmlns:cx1="http://schemas.microsoft.com/office/drawing/2015/9/8/chartex" xmlns:cx2="http://schemas.microsoft.com/office/drawing/2015/10/21/chartex" xmlns:cx3="http://schemas.microsoft.com/office/drawing/2016/5/9/chartex" xmlns:cx4="http://schemas.microsoft.com/office/drawing/2016/5/10/chartex" xmlns:cx5="http://schemas.microsoft.com/office/drawing/2016/5/11/chartex" xmlns:cx6="http://schemas.microsoft.com/office/drawing/2016/5/12/chartex" xmlns:cx7="http://schemas.microsoft.com/office/drawing/2016/5/13/chartex" xmlns:cx8="http://schemas.microsoft.com/office/drawing/2016/5/14/chartex" xmlns:mc="http://schemas.openxmlformats.org/markup-compatibility/2006" xmlns:aink="http://schemas.microsoft.com/office/drawing/2016/ink" xmlns:am3d="http://schemas.microsoft.com/office/drawing/2017/model3d" xmlns:o="urn:schemas-microsoft-com:office:office" xmlns:oel="http://schemas.microsoft.com/office/2019/extlst" xmlns:r="http://schemas.openxmlformats.org/officeDocument/2006/relationships" xmlns:m="http://schemas.openxmlformats.org/officeDocument/2006/math" xmlns:v="urn:schemas-microsoft-com:vml" xmlns:wp14="http://schemas.microsoft.com/office/word/2010/wordprocessingDrawing" xmlns:wp="http://schemas.openxmlformats.org/drawingml/2006/wordprocessingDrawing" xmlns:w10="urn:schemas-microsoft-com:office:word" xmlns:w="http://schemas.openxmlformats.org/wordprocessingml/2006/main" xmlns:w14="http://schemas.microsoft.com/office/word/2010/wordml" xmlns:w15="http://schemas.microsoft.com/office/word/2012/wordml" xmlns:w16cex="http://schemas.microsoft.com/office/word/2018/wordml/cex" xmlns:w16cid="http://schemas.microsoft.com/office/word/2016/wordml/cid" xmlns:w16="http://schemas.microsoft.com/office/word/2018/wordml" xmlns:w16du="http://schemas.microsoft.com/office/word/2023/wordml/word16du" xmlns:w16sdtdh="http://schemas.microsoft.com/office/word/2020/wordml/sdtdatahash" xmlns:w16sdtfl="http://schemas.microsoft.com/office/word/2024/wordml/sdtformatlock" xmlns:w16se="http://schemas.microsoft.com/office/word/2015/wordml/symex" xmlns:wpg="http://schemas.microsoft.com/office/word/2010/wordprocessingGroup" xmlns:wpi="http://schemas.microsoft.com/office/word/2010/wordprocessingInk" xmlns:wne="http://schemas.microsoft.com/office/word/2006/wordml" xmlns:wps="http://schemas.microsoft.com/office/word/2010/wordprocessingShape" mc:Ignorable="w14 w15 w16se w16cid w16 w16cex w16sdtdh w16sdtfl w16du wp14">
   <w:body>
     <w:p>
       <w:pPr>
@@ -142,7 +142,7 @@
           <w:sz w:val="23"/>
           <w:szCs w:val="23"/>
         </w:rPr>
-        <w:t xml:space="preserve">Senior Architect  </w:t>
+        <w:t xml:space="preserve">Senior </w:t>
       </w:r>
       <w:r>
         <w:rPr>
@@ -150,7 +150,7 @@
           <w:sz w:val="23"/>
           <w:szCs w:val="23"/>
         </w:rPr>
-        <w:tab/>
+        <w:t xml:space="preserve">Architect </w:t>
       </w:r>
       <w:r>
         <w:rPr>
@@ -166,7 +166,7 @@
           <w:sz w:val="23"/>
           <w:szCs w:val="23"/>
         </w:rPr>
-        <w:t xml:space="preserve">•  </w:t>
+        <w:tab/>
       </w:r>
       <w:r>
         <w:rPr>
@@ -174,53 +174,101 @@
           <w:sz w:val="23"/>
           <w:szCs w:val="23"/>
         </w:rPr>
+        <w:t xml:space="preserve">•  </w:t>
+      </w:r>
+      <w:r>
+        <w:rPr>
+          <w:b/>
+          <w:bCs/>
+          <w:color w:val="2E75B6"/>
+        </w:rPr>
         <w:t>Node.js</w:t>
       </w:r>
       <w:r>
         <w:rPr>
+          <w:b/>
+          <w:bCs/>
           <w:color w:val="2E75B6"/>
-          <w:sz w:val="23"/>
-          <w:szCs w:val="23"/>
         </w:rPr>
         <w:t xml:space="preserve"> </w:t>
       </w:r>
       <w:r>
         <w:rPr>
+          <w:b/>
+          <w:bCs/>
           <w:color w:val="2E75B6"/>
-          <w:sz w:val="23"/>
-          <w:szCs w:val="23"/>
-        </w:rPr>
-        <w:t xml:space="preserve">•  </w:t>
-      </w:r>
-      <w:r>
-        <w:rPr>
+        </w:rPr>
+        <w:t>• Python</w:t>
+      </w:r>
+      <w:r>
+        <w:rPr>
+          <w:b/>
+          <w:bCs/>
           <w:color w:val="2E75B6"/>
-          <w:sz w:val="23"/>
-          <w:szCs w:val="23"/>
-        </w:rPr>
-        <w:t>Python</w:t>
-      </w:r>
-      <w:r>
-        <w:rPr>
+        </w:rPr>
+        <w:t xml:space="preserve"> </w:t>
+      </w:r>
+      <w:r>
+        <w:rPr>
+          <w:b/>
+          <w:bCs/>
           <w:color w:val="2E75B6"/>
-          <w:sz w:val="23"/>
-          <w:szCs w:val="23"/>
+        </w:rPr>
+        <w:t xml:space="preserve">&amp; AI </w:t>
+      </w:r>
+      <w:r>
+        <w:rPr>
+          <w:b/>
+          <w:bCs/>
+          <w:color w:val="2E75B6"/>
+        </w:rPr>
+        <w:t xml:space="preserve">Engineering </w:t>
+      </w:r>
+      <w:r>
+        <w:rPr>
+          <w:b/>
+          <w:bCs/>
+          <w:color w:val="2E75B6"/>
+        </w:rPr>
+        <w:t>• Cloud</w:t>
+      </w:r>
+      <w:r>
+        <w:rPr>
+          <w:b/>
+          <w:bCs/>
+          <w:color w:val="2E75B6"/>
         </w:rPr>
         <w:t xml:space="preserve"> </w:t>
       </w:r>
       <w:r>
         <w:rPr>
+          <w:b/>
+          <w:bCs/>
           <w:color w:val="2E75B6"/>
-          <w:sz w:val="23"/>
-          <w:szCs w:val="23"/>
-        </w:rPr>
-        <w:t xml:space="preserve">&amp; AI Engineering  •  Cloud </w:t>
-      </w:r>
-      <w:r>
-        <w:rPr>
+        </w:rPr>
+        <w:t>(AWS, Azure</w:t>
+      </w:r>
+      <w:r>
+        <w:rPr>
+          <w:b/>
+          <w:bCs/>
           <w:color w:val="2E75B6"/>
-          <w:sz w:val="23"/>
-          <w:szCs w:val="23"/>
+        </w:rPr>
+        <w:t>, GCP</w:t>
+      </w:r>
+      <w:r>
+        <w:rPr>
+          <w:b/>
+          <w:bCs/>
+          <w:color w:val="2E75B6"/>
+        </w:rPr>
+        <w:t>)</w:t>
+      </w:r>
+      <w:r>
+        <w:rPr>
+          <w:b/>
+          <w:bCs/>
+          <w:color w:val="2E75B6"/>
         </w:rPr>
         <w:tab/>
       </w:r>
@@ -240,16 +288,25 @@
         </w:pBdr>
         <w:spacing w:after="10"/>
         <w:ind w:firstLine="720"/>
-      </w:pPr>
-      <w:r>
-        <w:rPr>
-          <w:color w:val="555555"/>
+        <w:rPr>
+          <w:b/>
+          <w:bCs/>
+          <w:color w:val="2E75B6"/>
+        </w:rPr>
+      </w:pPr>
+      <w:r>
+        <w:rPr>
+          <w:b/>
+          <w:bCs/>
+          <w:color w:val="2E75B6"/>
         </w:rPr>
         <w:t xml:space="preserve">                                       </w:t>
       </w:r>
       <w:r>
         <w:rPr>
-          <w:color w:val="555555"/>
+          <w:b/>
+          <w:bCs/>
+          <w:color w:val="2E75B6"/>
         </w:rPr>
         <w:t xml:space="preserve">•  </w:t>
       </w:r>
@@ -259,13 +316,7 @@
           <w:bCs/>
           <w:color w:val="2E75B6"/>
         </w:rPr>
-        <w:t>Hyderabad, India</w:t>
-      </w:r>
-      <w:r>
-        <w:rPr>
-          <w:color w:val="BBBBBB"/>
-        </w:rPr>
-        <w:t xml:space="preserve">  •   </w:t>
+        <w:t xml:space="preserve">Hyderabad, </w:t>
       </w:r>
       <w:r>
         <w:rPr>
@@ -273,7 +324,31 @@
           <w:bCs/>
           <w:color w:val="2E75B6"/>
         </w:rPr>
-        <w:t>20 Years Experience  •  AWS Certified</w:t>
+        <w:t>India</w:t>
+      </w:r>
+      <w:r>
+        <w:rPr>
+          <w:b/>
+          <w:bCs/>
+          <w:color w:val="2E75B6"/>
+        </w:rPr>
+        <w:t xml:space="preserve"> •</w:t>
+      </w:r>
+      <w:r>
+        <w:rPr>
+          <w:b/>
+          <w:bCs/>
+          <w:color w:val="2E75B6"/>
+        </w:rPr>
+        <w:t xml:space="preserve">   </w:t>
+      </w:r>
+      <w:r>
+        <w:rPr>
+          <w:b/>
+          <w:bCs/>
+          <w:color w:val="2E75B6"/>
+        </w:rPr>
+        <w:t xml:space="preserve">20 Years Experience  </w:t>
       </w:r>
     </w:p>
     <w:p>
@@ -3020,7 +3095,7 @@
                 <w:bCs/>
                 <w:color w:val="1B3A5C"/>
               </w:rPr>
-              <w:t>Discovery — IT Infrastructure Discovery Platform</w:t>
+              <w:t>Discovery — Platform</w:t>
             </w:r>
             <w:r>
               <w:rPr>
@@ -3028,7 +3103,16 @@
                 <w:sz w:val="19"/>
                 <w:szCs w:val="19"/>
               </w:rPr>
-              <w:t xml:space="preserve">   |  </w:t>
+              <w:t xml:space="preserve"> </w:t>
+            </w:r>
+            <w:proofErr w:type="gramStart"/>
+            <w:r>
+              <w:rPr>
+                <w:color w:val="555555"/>
+                <w:sz w:val="19"/>
+                <w:szCs w:val="19"/>
+              </w:rPr>
+              <w:t xml:space="preserve">|  </w:t>
             </w:r>
             <w:r>
               <w:rPr>
@@ -3038,7 +3122,7 @@
                 <w:sz w:val="19"/>
                 <w:szCs w:val="19"/>
               </w:rPr>
-              <w:t>Node.js</w:t>
+              <w:t>P</w:t>
             </w:r>
             <w:r>
               <w:rPr>
@@ -3048,8 +3132,9 @@
                 <w:sz w:val="19"/>
                 <w:szCs w:val="19"/>
               </w:rPr>
-              <w:t xml:space="preserve"> · </w:t>
-            </w:r>
+              <w:t>ython</w:t>
+            </w:r>
+            <w:proofErr w:type="gramEnd"/>
             <w:r>
               <w:rPr>
                 <w:i/>
@@ -3058,7 +3143,7 @@
                 <w:sz w:val="19"/>
                 <w:szCs w:val="19"/>
               </w:rPr>
-              <w:t>P</w:t>
+              <w:t xml:space="preserve"> · </w:t>
             </w:r>
             <w:r>
               <w:rPr>
@@ -3068,7 +3153,7 @@
                 <w:sz w:val="19"/>
                 <w:szCs w:val="19"/>
               </w:rPr>
-              <w:t>ython</w:t>
+              <w:t>Fast API</w:t>
             </w:r>
             <w:r>
               <w:rPr>
@@ -3078,7 +3163,7 @@
                 <w:sz w:val="19"/>
                 <w:szCs w:val="19"/>
               </w:rPr>
-              <w:t xml:space="preserve"> · </w:t>
+              <w:t xml:space="preserve"> </w:t>
             </w:r>
             <w:r>
               <w:rPr>
@@ -3088,7 +3173,7 @@
                 <w:sz w:val="19"/>
                 <w:szCs w:val="19"/>
               </w:rPr>
-              <w:t>Fast API</w:t>
+              <w:t xml:space="preserve">· </w:t>
             </w:r>
             <w:r>
               <w:rPr>
@@ -3098,7 +3183,7 @@
                 <w:sz w:val="19"/>
                 <w:szCs w:val="19"/>
               </w:rPr>
-              <w:t xml:space="preserve"> </w:t>
+              <w:t xml:space="preserve">Node.js · </w:t>
             </w:r>
             <w:r>
               <w:rPr>
@@ -3108,7 +3193,7 @@
                 <w:sz w:val="19"/>
                 <w:szCs w:val="19"/>
               </w:rPr>
-              <w:t xml:space="preserve">· </w:t>
+              <w:t xml:space="preserve">LLM / AWS Bedrock </w:t>
             </w:r>
             <w:r>
               <w:rPr>
@@ -3118,34 +3203,313 @@
                 <w:sz w:val="19"/>
                 <w:szCs w:val="19"/>
               </w:rPr>
-              <w:t xml:space="preserve">LLM / AWS Bedrock </w:t>
+              <w:t>· Agents</w:t>
+            </w:r>
+            <w:r>
+              <w:rPr>
+                <w:i/>
+                <w:iCs/>
+                <w:color w:val="2E75B6"/>
+                <w:sz w:val="19"/>
+                <w:szCs w:val="19"/>
+              </w:rPr>
+              <w:t xml:space="preserve"> </w:t>
+            </w:r>
+            <w:r>
+              <w:rPr>
+                <w:i/>
+                <w:iCs/>
+                <w:color w:val="2E75B6"/>
+                <w:sz w:val="19"/>
+                <w:szCs w:val="19"/>
+              </w:rPr>
+              <w:t xml:space="preserve">· </w:t>
+            </w:r>
+            <w:r>
+              <w:rPr>
+                <w:i/>
+                <w:iCs/>
+                <w:color w:val="2E75B6"/>
+                <w:sz w:val="19"/>
+                <w:szCs w:val="19"/>
+              </w:rPr>
+              <w:t>LLM/Azure OpenAI</w:t>
             </w:r>
           </w:p>
           <w:p>
-            <w:pPr>
-              <w:rPr>
-                <w:color w:val="1A1A1A"/>
-                <w:sz w:val="19"/>
-                <w:szCs w:val="19"/>
-              </w:rPr>
-            </w:pPr>
-            <w:r>
-              <w:rPr>
-                <w:color w:val="1A1A1A"/>
-                <w:sz w:val="19"/>
-                <w:szCs w:val="19"/>
-              </w:rPr>
-              <w:t xml:space="preserve">Multi-phase IT discovery solution for cloud migration planning using Nmap scans (shallow to deep). </w:t>
-            </w:r>
-          </w:p>
-          <w:p>
-            <w:r>
-              <w:rPr>
-                <w:color w:val="1A1A1A"/>
-                <w:sz w:val="19"/>
-                <w:szCs w:val="19"/>
-              </w:rPr>
-              <w:t>C3E Lightweight Appliance for air-gapped environments. Integrated LLM-based log analysis to automate root cause identification and remediation recommendations.</w:t>
+            <w:r>
+              <w:rPr>
+                <w:color w:val="1A1A1A"/>
+                <w:sz w:val="19"/>
+                <w:szCs w:val="19"/>
+              </w:rPr>
+              <w:t>Multi-</w:t>
+            </w:r>
+            <w:r>
+              <w:rPr>
+                <w:color w:val="1A1A1A"/>
+                <w:sz w:val="19"/>
+                <w:szCs w:val="19"/>
+              </w:rPr>
+              <w:t>tenant</w:t>
+            </w:r>
+            <w:r>
+              <w:rPr>
+                <w:color w:val="1A1A1A"/>
+                <w:sz w:val="19"/>
+                <w:szCs w:val="19"/>
+              </w:rPr>
+              <w:t xml:space="preserve"> IT discovery solution for cloud migration </w:t>
+            </w:r>
+            <w:r>
+              <w:rPr>
+                <w:color w:val="1A1A1A"/>
+                <w:sz w:val="19"/>
+                <w:szCs w:val="19"/>
+              </w:rPr>
+              <w:t>planning using sha</w:t>
+            </w:r>
+            <w:r>
+              <w:rPr>
+                <w:color w:val="1A1A1A"/>
+                <w:sz w:val="19"/>
+                <w:szCs w:val="19"/>
+              </w:rPr>
+              <w:t>llow and deep scan.</w:t>
+            </w:r>
+            <w:r>
+              <w:rPr>
+                <w:color w:val="1A1A1A"/>
+                <w:sz w:val="19"/>
+                <w:szCs w:val="19"/>
+              </w:rPr>
+              <w:t xml:space="preserve"> </w:t>
+            </w:r>
+            <w:r>
+              <w:rPr>
+                <w:color w:val="1A1A1A"/>
+                <w:sz w:val="19"/>
+                <w:szCs w:val="19"/>
+              </w:rPr>
+              <w:t xml:space="preserve">Implemented </w:t>
+            </w:r>
+            <w:r>
+              <w:rPr>
+                <w:color w:val="1A1A1A"/>
+                <w:sz w:val="19"/>
+                <w:szCs w:val="19"/>
+              </w:rPr>
+              <w:t>agent-</w:t>
+            </w:r>
+            <w:r>
+              <w:rPr>
+                <w:color w:val="1A1A1A"/>
+                <w:sz w:val="19"/>
+                <w:szCs w:val="19"/>
+              </w:rPr>
+              <w:t xml:space="preserve"> less </w:t>
+            </w:r>
+            <w:r>
+              <w:rPr>
+                <w:color w:val="1A1A1A"/>
+                <w:sz w:val="19"/>
+                <w:szCs w:val="19"/>
+              </w:rPr>
+              <w:t xml:space="preserve">discovery </w:t>
+            </w:r>
+            <w:r>
+              <w:rPr>
+                <w:color w:val="1A1A1A"/>
+                <w:sz w:val="19"/>
+                <w:szCs w:val="19"/>
+              </w:rPr>
+              <w:t xml:space="preserve">and </w:t>
+            </w:r>
+            <w:r>
+              <w:rPr>
+                <w:color w:val="1A1A1A"/>
+                <w:sz w:val="19"/>
+                <w:szCs w:val="19"/>
+              </w:rPr>
+              <w:t xml:space="preserve">C3E </w:t>
+            </w:r>
+            <w:r>
+              <w:rPr>
+                <w:color w:val="1A1A1A"/>
+                <w:sz w:val="19"/>
+                <w:szCs w:val="19"/>
+              </w:rPr>
+              <w:t xml:space="preserve">Lightweight Appliance for </w:t>
+            </w:r>
+            <w:r>
+              <w:rPr>
+                <w:color w:val="1A1A1A"/>
+                <w:sz w:val="19"/>
+                <w:szCs w:val="19"/>
+              </w:rPr>
+              <w:t>performing discovery in private</w:t>
+            </w:r>
+            <w:r>
+              <w:rPr>
+                <w:color w:val="1A1A1A"/>
+                <w:sz w:val="19"/>
+                <w:szCs w:val="19"/>
+              </w:rPr>
+              <w:t xml:space="preserve"> environments. Integrated LLM</w:t>
+            </w:r>
+            <w:r>
+              <w:rPr>
+                <w:color w:val="1A1A1A"/>
+                <w:sz w:val="19"/>
+                <w:szCs w:val="19"/>
+              </w:rPr>
+              <w:t xml:space="preserve"> and Agent </w:t>
+            </w:r>
+            <w:r>
+              <w:rPr>
+                <w:color w:val="1A1A1A"/>
+                <w:sz w:val="19"/>
+                <w:szCs w:val="19"/>
+              </w:rPr>
+              <w:t xml:space="preserve">based </w:t>
+            </w:r>
+            <w:r>
+              <w:rPr>
+                <w:color w:val="1A1A1A"/>
+                <w:sz w:val="19"/>
+                <w:szCs w:val="19"/>
+              </w:rPr>
+              <w:t>workflows</w:t>
+            </w:r>
+            <w:r>
+              <w:rPr>
+                <w:color w:val="1A1A1A"/>
+                <w:sz w:val="19"/>
+                <w:szCs w:val="19"/>
+              </w:rPr>
+              <w:t xml:space="preserve"> to create discovery and </w:t>
+            </w:r>
+            <w:r>
+              <w:rPr>
+                <w:color w:val="1A1A1A"/>
+                <w:sz w:val="19"/>
+                <w:szCs w:val="19"/>
+              </w:rPr>
+              <w:t>user-friendly</w:t>
+            </w:r>
+            <w:r>
+              <w:rPr>
+                <w:color w:val="1A1A1A"/>
+                <w:sz w:val="19"/>
+                <w:szCs w:val="19"/>
+              </w:rPr>
+              <w:t xml:space="preserve"> </w:t>
+            </w:r>
+            <w:r>
+              <w:rPr>
+                <w:color w:val="1A1A1A"/>
+                <w:sz w:val="19"/>
+                <w:szCs w:val="19"/>
+              </w:rPr>
+              <w:t>customer</w:t>
+            </w:r>
+            <w:r>
+              <w:rPr>
+                <w:color w:val="1A1A1A"/>
+                <w:sz w:val="19"/>
+                <w:szCs w:val="19"/>
+              </w:rPr>
+              <w:t xml:space="preserve"> </w:t>
+            </w:r>
+            <w:r>
+              <w:rPr>
+                <w:color w:val="1A1A1A"/>
+                <w:sz w:val="19"/>
+                <w:szCs w:val="19"/>
+              </w:rPr>
+              <w:t>interactions</w:t>
+            </w:r>
+            <w:r>
+              <w:rPr>
+                <w:color w:val="1A1A1A"/>
+                <w:sz w:val="19"/>
+                <w:szCs w:val="19"/>
+              </w:rPr>
+              <w:t xml:space="preserve"> and created </w:t>
+            </w:r>
+            <w:proofErr w:type="gramStart"/>
+            <w:r>
+              <w:rPr>
+                <w:color w:val="1A1A1A"/>
+                <w:sz w:val="19"/>
+                <w:szCs w:val="19"/>
+              </w:rPr>
+              <w:t>a</w:t>
+            </w:r>
+            <w:proofErr w:type="gramEnd"/>
+            <w:r>
+              <w:rPr>
+                <w:color w:val="1A1A1A"/>
+                <w:sz w:val="19"/>
+                <w:szCs w:val="19"/>
+              </w:rPr>
+              <w:t xml:space="preserve"> </w:t>
+            </w:r>
+            <w:r>
+              <w:rPr>
+                <w:color w:val="1A1A1A"/>
+                <w:sz w:val="19"/>
+                <w:szCs w:val="19"/>
+              </w:rPr>
+              <w:t xml:space="preserve">agentic </w:t>
+            </w:r>
+            <w:r>
+              <w:rPr>
+                <w:color w:val="1A1A1A"/>
+                <w:sz w:val="19"/>
+                <w:szCs w:val="19"/>
+              </w:rPr>
+              <w:t>framework for the l</w:t>
+            </w:r>
+            <w:r>
+              <w:rPr>
+                <w:color w:val="1A1A1A"/>
+                <w:sz w:val="19"/>
+                <w:szCs w:val="19"/>
+              </w:rPr>
+              <w:t xml:space="preserve">og analysis to </w:t>
+            </w:r>
+            <w:r>
+              <w:rPr>
+                <w:color w:val="1A1A1A"/>
+                <w:sz w:val="19"/>
+                <w:szCs w:val="19"/>
+              </w:rPr>
+              <w:t>find the automated</w:t>
+            </w:r>
+            <w:r>
+              <w:rPr>
+                <w:color w:val="1A1A1A"/>
+                <w:sz w:val="19"/>
+                <w:szCs w:val="19"/>
+              </w:rPr>
+              <w:t xml:space="preserve"> root cause identification and remediation</w:t>
+            </w:r>
+            <w:r>
+              <w:rPr>
+                <w:color w:val="1A1A1A"/>
+                <w:sz w:val="19"/>
+                <w:szCs w:val="19"/>
+              </w:rPr>
+              <w:t>s</w:t>
+            </w:r>
+            <w:r>
+              <w:rPr>
+                <w:color w:val="1A1A1A"/>
+                <w:sz w:val="19"/>
+                <w:szCs w:val="19"/>
+              </w:rPr>
+              <w:t>.</w:t>
             </w:r>
           </w:p>
         </w:tc>
@@ -3325,7 +3689,287 @@
                 <w:sz w:val="19"/>
                 <w:szCs w:val="19"/>
               </w:rPr>
-              <w:t>Enterprise CMDB platform managing Configuration Items and topological relationships at scale. Integrated ServiceNow and Azure Graph API for automated CI data ingestion with startup automation pipelines — SaaS-ready, supporting cloud and private deployments.</w:t>
+              <w:t xml:space="preserve">Implemented </w:t>
+            </w:r>
+            <w:r>
+              <w:rPr>
+                <w:color w:val="1A1A1A"/>
+                <w:sz w:val="19"/>
+                <w:szCs w:val="19"/>
+              </w:rPr>
+              <w:t>e</w:t>
+            </w:r>
+            <w:r>
+              <w:rPr>
+                <w:color w:val="1A1A1A"/>
+                <w:sz w:val="19"/>
+                <w:szCs w:val="19"/>
+              </w:rPr>
+              <w:t xml:space="preserve">nterprise CMDB </w:t>
+            </w:r>
+            <w:r>
+              <w:rPr>
+                <w:color w:val="1A1A1A"/>
+                <w:sz w:val="19"/>
+                <w:szCs w:val="19"/>
+              </w:rPr>
+              <w:t>application for</w:t>
+            </w:r>
+            <w:r>
+              <w:rPr>
+                <w:color w:val="1A1A1A"/>
+                <w:sz w:val="19"/>
+                <w:szCs w:val="19"/>
+              </w:rPr>
+              <w:t xml:space="preserve"> </w:t>
+            </w:r>
+            <w:r>
+              <w:rPr>
+                <w:color w:val="1A1A1A"/>
+                <w:sz w:val="19"/>
+                <w:szCs w:val="19"/>
+              </w:rPr>
+              <w:t>managing multi-Cloud</w:t>
+            </w:r>
+            <w:r>
+              <w:rPr>
+                <w:color w:val="1A1A1A"/>
+                <w:sz w:val="19"/>
+                <w:szCs w:val="19"/>
+              </w:rPr>
+              <w:t xml:space="preserve"> and Open prem </w:t>
+            </w:r>
+            <w:r>
+              <w:rPr>
+                <w:color w:val="1A1A1A"/>
+                <w:sz w:val="19"/>
+                <w:szCs w:val="19"/>
+              </w:rPr>
+              <w:t>c</w:t>
+            </w:r>
+            <w:r>
+              <w:rPr>
+                <w:color w:val="1A1A1A"/>
+                <w:sz w:val="19"/>
+                <w:szCs w:val="19"/>
+              </w:rPr>
+              <w:t>onfiguration Items</w:t>
+            </w:r>
+            <w:r>
+              <w:rPr>
+                <w:color w:val="1A1A1A"/>
+                <w:sz w:val="19"/>
+                <w:szCs w:val="19"/>
+              </w:rPr>
+              <w:t xml:space="preserve"> for the </w:t>
+            </w:r>
+            <w:r>
+              <w:rPr>
+                <w:color w:val="1A1A1A"/>
+                <w:sz w:val="19"/>
+                <w:szCs w:val="19"/>
+              </w:rPr>
+              <w:t>client’s</w:t>
+            </w:r>
+            <w:r>
+              <w:rPr>
+                <w:color w:val="1A1A1A"/>
+                <w:sz w:val="19"/>
+                <w:szCs w:val="19"/>
+              </w:rPr>
+              <w:t xml:space="preserve"> hardware and software </w:t>
+            </w:r>
+            <w:r>
+              <w:rPr>
+                <w:color w:val="1A1A1A"/>
+                <w:sz w:val="19"/>
+                <w:szCs w:val="19"/>
+              </w:rPr>
+              <w:t>components</w:t>
+            </w:r>
+            <w:r>
+              <w:rPr>
+                <w:color w:val="1A1A1A"/>
+                <w:sz w:val="19"/>
+                <w:szCs w:val="19"/>
+              </w:rPr>
+              <w:t xml:space="preserve"> and creating the </w:t>
+            </w:r>
+            <w:r>
+              <w:rPr>
+                <w:color w:val="1A1A1A"/>
+                <w:sz w:val="19"/>
+                <w:szCs w:val="19"/>
+              </w:rPr>
+              <w:t xml:space="preserve">topological relationships </w:t>
+            </w:r>
+            <w:r>
+              <w:rPr>
+                <w:color w:val="1A1A1A"/>
+                <w:sz w:val="19"/>
+                <w:szCs w:val="19"/>
+              </w:rPr>
+              <w:t>between them</w:t>
+            </w:r>
+            <w:r>
+              <w:rPr>
+                <w:color w:val="1A1A1A"/>
+                <w:sz w:val="19"/>
+                <w:szCs w:val="19"/>
+              </w:rPr>
+              <w:t>.</w:t>
+            </w:r>
+            <w:r>
+              <w:rPr>
+                <w:color w:val="1A1A1A"/>
+                <w:sz w:val="19"/>
+                <w:szCs w:val="19"/>
+              </w:rPr>
+              <w:t xml:space="preserve"> Integrated </w:t>
+            </w:r>
+            <w:r>
+              <w:rPr>
+                <w:color w:val="1A1A1A"/>
+                <w:sz w:val="19"/>
+                <w:szCs w:val="19"/>
+              </w:rPr>
+              <w:t>CMDB</w:t>
+            </w:r>
+            <w:r>
+              <w:rPr>
+                <w:color w:val="1A1A1A"/>
+                <w:sz w:val="19"/>
+                <w:szCs w:val="19"/>
+              </w:rPr>
+              <w:t xml:space="preserve"> </w:t>
+            </w:r>
+            <w:r>
+              <w:rPr>
+                <w:color w:val="1A1A1A"/>
+                <w:sz w:val="19"/>
+                <w:szCs w:val="19"/>
+              </w:rPr>
+              <w:t xml:space="preserve">various </w:t>
+            </w:r>
+            <w:r>
+              <w:rPr>
+                <w:color w:val="1A1A1A"/>
+                <w:sz w:val="19"/>
+                <w:szCs w:val="19"/>
+              </w:rPr>
+              <w:t xml:space="preserve">cloud plugins for </w:t>
+            </w:r>
+            <w:r>
+              <w:rPr>
+                <w:color w:val="1A1A1A"/>
+                <w:sz w:val="19"/>
+                <w:szCs w:val="19"/>
+              </w:rPr>
+              <w:t>AWS, Azure, GCP</w:t>
+            </w:r>
+            <w:r>
+              <w:rPr>
+                <w:color w:val="1A1A1A"/>
+                <w:sz w:val="19"/>
+                <w:szCs w:val="19"/>
+              </w:rPr>
+              <w:t xml:space="preserve"> and external interfaces for </w:t>
+            </w:r>
+            <w:r>
+              <w:rPr>
+                <w:color w:val="1A1A1A"/>
+                <w:sz w:val="19"/>
+                <w:szCs w:val="19"/>
+              </w:rPr>
+              <w:t>ServiceNow and Azure Graph API</w:t>
+            </w:r>
+            <w:r>
+              <w:rPr>
+                <w:color w:val="1A1A1A"/>
+                <w:sz w:val="19"/>
+                <w:szCs w:val="19"/>
+              </w:rPr>
+              <w:t xml:space="preserve"> </w:t>
+            </w:r>
+            <w:r>
+              <w:rPr>
+                <w:color w:val="1A1A1A"/>
+                <w:sz w:val="19"/>
+                <w:szCs w:val="19"/>
+              </w:rPr>
+              <w:t xml:space="preserve">for automated CI data ingestion </w:t>
+            </w:r>
+            <w:r>
+              <w:rPr>
+                <w:color w:val="1A1A1A"/>
+                <w:sz w:val="19"/>
+                <w:szCs w:val="19"/>
+              </w:rPr>
+              <w:t xml:space="preserve">and </w:t>
+            </w:r>
+            <w:r>
+              <w:rPr>
+                <w:color w:val="1A1A1A"/>
+                <w:sz w:val="19"/>
+                <w:szCs w:val="19"/>
+              </w:rPr>
+              <w:t>developed</w:t>
+            </w:r>
+            <w:r>
+              <w:rPr>
+                <w:color w:val="1A1A1A"/>
+                <w:sz w:val="19"/>
+                <w:szCs w:val="19"/>
+              </w:rPr>
+              <w:t xml:space="preserve"> efficient middleware </w:t>
+            </w:r>
+            <w:r>
+              <w:rPr>
+                <w:color w:val="1A1A1A"/>
+                <w:sz w:val="19"/>
+                <w:szCs w:val="19"/>
+              </w:rPr>
+              <w:t>for</w:t>
+            </w:r>
+            <w:r>
+              <w:rPr>
+                <w:color w:val="1A1A1A"/>
+                <w:sz w:val="19"/>
+                <w:szCs w:val="19"/>
+              </w:rPr>
+              <w:t xml:space="preserve"> data </w:t>
+            </w:r>
+            <w:r>
+              <w:rPr>
+                <w:color w:val="1A1A1A"/>
+                <w:sz w:val="19"/>
+                <w:szCs w:val="19"/>
+              </w:rPr>
+              <w:t xml:space="preserve">accuracy and </w:t>
+            </w:r>
+            <w:r>
+              <w:rPr>
+                <w:color w:val="1A1A1A"/>
+                <w:sz w:val="19"/>
+                <w:szCs w:val="19"/>
+              </w:rPr>
+              <w:t xml:space="preserve">data </w:t>
+            </w:r>
+            <w:r>
+              <w:rPr>
+                <w:color w:val="1A1A1A"/>
+                <w:sz w:val="19"/>
+                <w:szCs w:val="19"/>
+              </w:rPr>
+              <w:t>tran</w:t>
+            </w:r>
+            <w:r>
+              <w:rPr>
+                <w:color w:val="1A1A1A"/>
+                <w:sz w:val="19"/>
+                <w:szCs w:val="19"/>
+              </w:rPr>
+              <w:t>slations.</w:t>
             </w:r>
           </w:p>
         </w:tc>
@@ -3798,7 +4442,7 @@
 </file>
 
 <file path=word/numbering.xml><?xml version="1.0" encoding="utf-8"?>
-<w:numbering xmlns:wpc="http://schemas.microsoft.com/office/word/2010/wordprocessingCanvas" xmlns:cx="http://schemas.microsoft.com/office/drawing/2014/chartex" xmlns:cx1="http://schemas.microsoft.com/office/drawing/2015/9/8/chartex" xmlns:cx2="http://schemas.microsoft.com/office/drawing/2015/10/21/chartex" xmlns:cx3="http://schemas.microsoft.com/office/drawing/2016/5/9/chartex" xmlns:cx4="http://schemas.microsoft.com/office/drawing/2016/5/10/chartex" xmlns:cx5="http://schemas.microsoft.com/office/drawing/2016/5/11/chartex" xmlns:cx6="http://schemas.microsoft.com/office/drawing/2016/5/12/chartex" xmlns:cx7="http://schemas.microsoft.com/office/drawing/2016/5/13/chartex" xmlns:cx8="http://schemas.microsoft.com/office/drawing/2016/5/14/chartex" xmlns:mc="http://schemas.openxmlformats.org/markup-compatibility/2006" xmlns:aink="http://schemas.microsoft.com/office/drawing/2016/ink" xmlns:am3d="http://schemas.microsoft.com/office/drawing/2017/model3d" xmlns:o="urn:schemas-microsoft-com:office:office" xmlns:oel="http://schemas.microsoft.com/office/2019/extlst" xmlns:r="http://schemas.openxmlformats.org/officeDocument/2006/relationships" xmlns:m="http://schemas.openxmlformats.org/officeDocument/2006/math" xmlns:v="urn:schemas-microsoft-com:vml" xmlns:wp14="http://schemas.microsoft.com/office/word/2010/wordprocessingDrawing" xmlns:wp="http://schemas.openxmlformats.org/drawingml/2006/wordprocessingDrawing" xmlns:w10="urn:schemas-microsoft-com:office:word" xmlns:w="http://schemas.openxmlformats.org/wordprocessingml/2006/main" xmlns:w14="http://schemas.microsoft.com/office/word/2010/wordml" xmlns:w15="http://schemas.microsoft.com/office/word/2012/wordml" xmlns:w16cex="http://schemas.microsoft.com/office/word/2018/wordml/cex" xmlns:w16cid="http://schemas.microsoft.com/office/word/2016/wordml/cid" xmlns:w16="http://schemas.microsoft.com/office/word/2018/wordml" xmlns:w16sdtdh="http://schemas.microsoft.com/office/word/2020/wordml/sdtdatahash" xmlns:w16se="http://schemas.microsoft.com/office/word/2015/wordml/symex" xmlns:wpg="http://schemas.microsoft.com/office/word/2010/wordprocessingGroup" xmlns:wpi="http://schemas.microsoft.com/office/word/2010/wordprocessingInk" xmlns:wne="http://schemas.microsoft.com/office/word/2006/wordml" xmlns:wps="http://schemas.microsoft.com/office/word/2010/wordprocessingShape" mc:Ignorable="w14 w15 w16se w16cid w16 w16cex w16sdtdh wp14">
+<w:numbering xmlns:wpc="http://schemas.microsoft.com/office/word/2010/wordprocessingCanvas" xmlns:cx="http://schemas.microsoft.com/office/drawing/2014/chartex" xmlns:cx1="http://schemas.microsoft.com/office/drawing/2015/9/8/chartex" xmlns:cx2="http://schemas.microsoft.com/office/drawing/2015/10/21/chartex" xmlns:cx3="http://schemas.microsoft.com/office/drawing/2016/5/9/chartex" xmlns:cx4="http://schemas.microsoft.com/office/drawing/2016/5/10/chartex" xmlns:cx5="http://schemas.microsoft.com/office/drawing/2016/5/11/chartex" xmlns:cx6="http://schemas.microsoft.com/office/drawing/2016/5/12/chartex" xmlns:cx7="http://schemas.microsoft.com/office/drawing/2016/5/13/chartex" xmlns:cx8="http://schemas.microsoft.com/office/drawing/2016/5/14/chartex" xmlns:mc="http://schemas.openxmlformats.org/markup-compatibility/2006" xmlns:aink="http://schemas.microsoft.com/office/drawing/2016/ink" xmlns:am3d="http://schemas.microsoft.com/office/drawing/2017/model3d" xmlns:o="urn:schemas-microsoft-com:office:office" xmlns:oel="http://schemas.microsoft.com/office/2019/extlst" xmlns:r="http://schemas.openxmlformats.org/officeDocument/2006/relationships" xmlns:m="http://schemas.openxmlformats.org/officeDocument/2006/math" xmlns:v="urn:schemas-microsoft-com:vml" xmlns:wp14="http://schemas.microsoft.com/office/word/2010/wordprocessingDrawing" xmlns:wp="http://schemas.openxmlformats.org/drawingml/2006/wordprocessingDrawing" xmlns:w10="urn:schemas-microsoft-com:office:word" xmlns:w="http://schemas.openxmlformats.org/wordprocessingml/2006/main" xmlns:w14="http://schemas.microsoft.com/office/word/2010/wordml" xmlns:w15="http://schemas.microsoft.com/office/word/2012/wordml" xmlns:w16cex="http://schemas.microsoft.com/office/word/2018/wordml/cex" xmlns:w16cid="http://schemas.microsoft.com/office/word/2016/wordml/cid" xmlns:w16="http://schemas.microsoft.com/office/word/2018/wordml" xmlns:w16du="http://schemas.microsoft.com/office/word/2023/wordml/word16du" xmlns:w16sdtdh="http://schemas.microsoft.com/office/word/2020/wordml/sdtdatahash" xmlns:w16sdtfl="http://schemas.microsoft.com/office/word/2024/wordml/sdtformatlock" xmlns:w16se="http://schemas.microsoft.com/office/word/2015/wordml/symex" xmlns:wpg="http://schemas.microsoft.com/office/word/2010/wordprocessingGroup" xmlns:wpi="http://schemas.microsoft.com/office/word/2010/wordprocessingInk" xmlns:wne="http://schemas.microsoft.com/office/word/2006/wordml" xmlns:wps="http://schemas.microsoft.com/office/word/2010/wordprocessingShape" mc:Ignorable="w14 w15 w16se w16cid w16 w16cex w16sdtdh w16sdtfl w16du wp14">
   <w:abstractNum w:abstractNumId="0" w15:restartNumberingAfterBreak="0">
     <w:nsid w:val="0511031B"/>
     <w:multiLevelType w:val="hybridMultilevel"/>
@@ -3955,7 +4599,7 @@
 </file>
 
 <file path=word/styles.xml><?xml version="1.0" encoding="utf-8"?>
-<w:styles xmlns:mc="http://schemas.openxmlformats.org/markup-compatibility/2006" xmlns:r="http://schemas.openxmlformats.org/officeDocument/2006/relationships" xmlns:w="http://schemas.openxmlformats.org/wordprocessingml/2006/main" xmlns:w14="http://schemas.microsoft.com/office/word/2010/wordml" xmlns:w15="http://schemas.microsoft.com/office/word/2012/wordml" xmlns:w16cex="http://schemas.microsoft.com/office/word/2018/wordml/cex" xmlns:w16cid="http://schemas.microsoft.com/office/word/2016/wordml/cid" xmlns:w16="http://schemas.microsoft.com/office/word/2018/wordml" xmlns:w16sdtdh="http://schemas.microsoft.com/office/word/2020/wordml/sdtdatahash" xmlns:w16se="http://schemas.microsoft.com/office/word/2015/wordml/symex" mc:Ignorable="w14 w15 w16se w16cid w16 w16cex w16sdtdh">
+<w:styles xmlns:mc="http://schemas.openxmlformats.org/markup-compatibility/2006" xmlns:r="http://schemas.openxmlformats.org/officeDocument/2006/relationships" xmlns:w="http://schemas.openxmlformats.org/wordprocessingml/2006/main" xmlns:w14="http://schemas.microsoft.com/office/word/2010/wordml" xmlns:w15="http://schemas.microsoft.com/office/word/2012/wordml" xmlns:w16cex="http://schemas.microsoft.com/office/word/2018/wordml/cex" xmlns:w16cid="http://schemas.microsoft.com/office/word/2016/wordml/cid" xmlns:w16="http://schemas.microsoft.com/office/word/2018/wordml" xmlns:w16du="http://schemas.microsoft.com/office/word/2023/wordml/word16du" xmlns:w16sdtdh="http://schemas.microsoft.com/office/word/2020/wordml/sdtdatahash" xmlns:w16sdtfl="http://schemas.microsoft.com/office/word/2024/wordml/sdtformatlock" xmlns:w16se="http://schemas.microsoft.com/office/word/2015/wordml/symex" mc:Ignorable="w14 w15 w16se w16cid w16 w16cex w16sdtdh w16sdtfl w16du">
   <w:docDefaults>
     <w:rPrDefault>
       <w:rPr>

</xml_diff>